<commit_message>
docs: complete week11 study handoff package
</commit_message>
<xml_diff>
--- a/docs/notes/QL_vs_DQN_大Grid对比报告.docx
+++ b/docs/notes/QL_vs_DQN_大Grid对比报告.docx
@@ -58,7 +58,7 @@
           <w:b w:val="0"/>
           <w:sz w:val="22"/>
         </w:rPr>
-        <w:t>同一个 GridWorld 环境，两种算法，三种规模：</w:t>
+        <w:t>同一个 GridWorld 环境，两种算法，两种规模：</w:t>
       </w:r>
     </w:p>
     <w:p>
@@ -307,78 +307,6 @@
           </w:p>
         </w:tc>
       </w:tr>
-      <w:tr>
-        <w:tc>
-          <w:tcPr>
-            <w:tcW w:type="dxa" w:w="1728"/>
-          </w:tcPr>
-          <w:p>
-            <w:r>
-              <w:rPr>
-                <w:rFonts w:ascii="微软雅黑" w:hAnsi="微软雅黑"/>
-                <w:sz w:val="20"/>
-              </w:rPr>
-              <w:t>12×12</w:t>
-            </w:r>
-          </w:p>
-        </w:tc>
-        <w:tc>
-          <w:tcPr>
-            <w:tcW w:type="dxa" w:w="1728"/>
-          </w:tcPr>
-          <w:p>
-            <w:r>
-              <w:rPr>
-                <w:rFonts w:ascii="微软雅黑" w:hAnsi="微软雅黑"/>
-                <w:sz w:val="20"/>
-              </w:rPr>
-              <w:t>144</w:t>
-            </w:r>
-          </w:p>
-        </w:tc>
-        <w:tc>
-          <w:tcPr>
-            <w:tcW w:type="dxa" w:w="1728"/>
-          </w:tcPr>
-          <w:p>
-            <w:r>
-              <w:rPr>
-                <w:rFonts w:ascii="微软雅黑" w:hAnsi="微软雅黑"/>
-                <w:sz w:val="20"/>
-              </w:rPr>
-              <w:t>576 (144×4)</w:t>
-            </w:r>
-          </w:p>
-        </w:tc>
-        <w:tc>
-          <w:tcPr>
-            <w:tcW w:type="dxa" w:w="1728"/>
-          </w:tcPr>
-          <w:p>
-            <w:r>
-              <w:rPr>
-                <w:rFonts w:ascii="微软雅黑" w:hAnsi="微软雅黑"/>
-                <w:sz w:val="20"/>
-              </w:rPr>
-              <w:t>~9500</w:t>
-            </w:r>
-          </w:p>
-        </w:tc>
-        <w:tc>
-          <w:tcPr>
-            <w:tcW w:type="dxa" w:w="1728"/>
-          </w:tcPr>
-          <w:p>
-            <w:r>
-              <w:rPr>
-                <w:rFonts w:ascii="微软雅黑" w:hAnsi="微软雅黑"/>
-                <w:sz w:val="20"/>
-              </w:rPr>
-              <w:t>8000（未跑完）</w:t>
-            </w:r>
-          </w:p>
-        </w:tc>
-      </w:tr>
     </w:tbl>
     <w:p>
       <w:pPr>
@@ -584,7 +512,7 @@
                 <w:rFonts w:ascii="微软雅黑" w:hAnsi="微软雅黑"/>
                 <w:sz w:val="20"/>
               </w:rPr>
-              <w:t>0.3s</w:t>
+              <w:t>0.18s</w:t>
             </w:r>
           </w:p>
         </w:tc>
@@ -598,7 +526,7 @@
                 <w:rFonts w:ascii="微软雅黑" w:hAnsi="微软雅黑"/>
                 <w:sz w:val="20"/>
               </w:rPr>
-              <w:t>248s</w:t>
+              <w:t>218.50s</w:t>
             </w:r>
           </w:p>
         </w:tc>
@@ -698,7 +626,7 @@
                 <w:rFonts w:ascii="微软雅黑" w:hAnsi="微软雅黑"/>
                 <w:sz w:val="20"/>
               </w:rPr>
-              <w:t>+0.83</w:t>
+              <w:t>+0.81</w:t>
             </w:r>
           </w:p>
         </w:tc>
@@ -712,7 +640,7 @@
                 <w:rFonts w:ascii="微软雅黑" w:hAnsi="微软雅黑"/>
                 <w:sz w:val="20"/>
               </w:rPr>
-              <w:t>+0.82</w:t>
+              <w:t>+0.78</w:t>
             </w:r>
           </w:p>
         </w:tc>
@@ -742,7 +670,7 @@
                 <w:rFonts w:ascii="微软雅黑" w:hAnsi="微软雅黑"/>
                 <w:sz w:val="20"/>
               </w:rPr>
-              <w:t>91.5%</w:t>
+              <w:t>90.5%</w:t>
             </w:r>
           </w:p>
         </w:tc>
@@ -756,7 +684,7 @@
                 <w:rFonts w:ascii="微软雅黑" w:hAnsi="微软雅黑"/>
                 <w:sz w:val="20"/>
               </w:rPr>
-              <w:t>91.0%</w:t>
+              <w:t>89.0%</w:t>
             </w:r>
           </w:p>
         </w:tc>
@@ -785,7 +713,7 @@
           <w:color w:val="1F3A5F"/>
           <w:sz w:val="22"/>
         </w:rPr>
-        <w:t>两个方法效果几乎一样。DQN 参数多 21 倍、慢 800 倍，但最终策略都能走到终点。</w:t>
+        <w:t>两个方法效果接近。DQN 参数多 21 倍、慢约 1200 倍，但最终策略也能较稳定走到终点。</w:t>
       </w:r>
     </w:p>
     <w:p>
@@ -837,7 +765,7 @@
           <w:color w:val="333333"/>
           <w:sz w:val="19"/>
         </w:rPr>
-        <w:t xml:space="preserve"> ↓  X  →  ↓ </w:t>
+        <w:t xml:space="preserve"> ↑  X  →  ↓ </w:t>
       </w:r>
     </w:p>
     <w:p>
@@ -851,7 +779,7 @@
           <w:color w:val="333333"/>
           <w:sz w:val="19"/>
         </w:rPr>
-        <w:t xml:space="preserve"> ↓  ↓  →  ↓ </w:t>
+        <w:t xml:space="preserve"> ↓  ↓  ↓  ↓ </w:t>
       </w:r>
     </w:p>
     <w:p>
@@ -892,7 +820,7 @@
           <w:color w:val="333333"/>
           <w:sz w:val="19"/>
         </w:rPr>
-        <w:t xml:space="preserve"> ↑  →  →  ↓ </w:t>
+        <w:t xml:space="preserve"> ↓  →  →  → </w:t>
       </w:r>
     </w:p>
     <w:p>
@@ -906,7 +834,7 @@
           <w:color w:val="333333"/>
           <w:sz w:val="19"/>
         </w:rPr>
-        <w:t xml:space="preserve"> ↓  X  ↓  ↓ </w:t>
+        <w:t xml:space="preserve"> ↓  X  →  → </w:t>
       </w:r>
     </w:p>
     <w:p>
@@ -920,7 +848,7 @@
           <w:color w:val="333333"/>
           <w:sz w:val="19"/>
         </w:rPr>
-        <w:t xml:space="preserve"> ↓  ↓  →  ↓ </w:t>
+        <w:t xml:space="preserve"> →  →  →  → </w:t>
       </w:r>
     </w:p>
     <w:p>
@@ -1164,7 +1092,7 @@
                 <w:rFonts w:ascii="微软雅黑" w:hAnsi="微软雅黑"/>
                 <w:sz w:val="20"/>
               </w:rPr>
-              <w:t>0.78s</w:t>
+              <w:t>0.45s</w:t>
             </w:r>
           </w:p>
         </w:tc>
@@ -1178,7 +1106,7 @@
                 <w:rFonts w:ascii="微软雅黑" w:hAnsi="微软雅黑"/>
                 <w:sz w:val="20"/>
               </w:rPr>
-              <w:t>835s</w:t>
+              <w:t>851.14s</w:t>
             </w:r>
           </w:p>
         </w:tc>
@@ -1278,7 +1206,7 @@
                 <w:rFonts w:ascii="微软雅黑" w:hAnsi="微软雅黑"/>
                 <w:sz w:val="20"/>
               </w:rPr>
-              <w:t>+0.76</w:t>
+              <w:t>+0.81</w:t>
             </w:r>
           </w:p>
         </w:tc>
@@ -1292,7 +1220,7 @@
                 <w:rFonts w:ascii="微软雅黑" w:hAnsi="微软雅黑"/>
                 <w:sz w:val="20"/>
               </w:rPr>
-              <w:t>+0.40</w:t>
+              <w:t>+0.50</w:t>
             </w:r>
           </w:p>
         </w:tc>
@@ -1322,7 +1250,7 @@
                 <w:rFonts w:ascii="微软雅黑" w:hAnsi="微软雅黑"/>
                 <w:sz w:val="20"/>
               </w:rPr>
-              <w:t>88%</w:t>
+              <w:t>90.5%</w:t>
             </w:r>
           </w:p>
         </w:tc>
@@ -1336,7 +1264,7 @@
                 <w:rFonts w:ascii="微软雅黑" w:hAnsi="微软雅黑"/>
                 <w:sz w:val="20"/>
               </w:rPr>
-              <w:t>70%</w:t>
+              <w:t>75.0%</w:t>
             </w:r>
           </w:p>
         </w:tc>
@@ -1377,7 +1305,7 @@
           <w:color w:val="333333"/>
           <w:sz w:val="19"/>
         </w:rPr>
-        <w:t xml:space="preserve"> →  →  →  →  ↓  ↓  ↓  ↓ </w:t>
+        <w:t xml:space="preserve"> ↓  →  →  →  →  ↓  ↓  ↓ </w:t>
       </w:r>
     </w:p>
     <w:p>
@@ -1391,7 +1319,7 @@
           <w:color w:val="333333"/>
           <w:sz w:val="19"/>
         </w:rPr>
-        <w:t xml:space="preserve"> ↓  X  ↓  →  ↓  ↓  ↓  ↓ </w:t>
+        <w:t xml:space="preserve"> ↓  X  ↓  →  →  ↓  ↓  ↓ </w:t>
       </w:r>
     </w:p>
     <w:p>
@@ -1405,7 +1333,7 @@
           <w:color w:val="333333"/>
           <w:sz w:val="19"/>
         </w:rPr>
-        <w:t xml:space="preserve"> ↓  →  →  ↓  ↓  →  ↓  ↓ </w:t>
+        <w:t xml:space="preserve"> ↓  ↓  ↓  →  →  →  ↓  ↓ </w:t>
       </w:r>
     </w:p>
     <w:p>
@@ -1419,7 +1347,7 @@
           <w:color w:val="333333"/>
           <w:sz w:val="19"/>
         </w:rPr>
-        <w:t xml:space="preserve"> →  →  →  →  →  →  ↓  ↓ </w:t>
+        <w:t xml:space="preserve"> ↓  →  ↓  ↓  ↓  →  ↓  ↓ </w:t>
       </w:r>
     </w:p>
     <w:p>
@@ -1446,7 +1374,7 @@
           <w:color w:val="333333"/>
           <w:sz w:val="19"/>
         </w:rPr>
-        <w:t xml:space="preserve"> ↓  ↓  ↓  ↓  ↓  ↓  ↓  ↓ </w:t>
+        <w:t xml:space="preserve"> →  →  →  →  →  →  →  → </w:t>
       </w:r>
     </w:p>
     <w:p>
@@ -1460,7 +1388,7 @@
           <w:color w:val="333333"/>
           <w:sz w:val="19"/>
         </w:rPr>
-        <w:t xml:space="preserve"> ↑  X  ↓  ↓  ↓  ↓  ↓  ↓ </w:t>
+        <w:t xml:space="preserve"> →  X  →  →  →  →  →  → </w:t>
       </w:r>
     </w:p>
     <w:p>
@@ -1474,7 +1402,7 @@
           <w:color w:val="333333"/>
           <w:sz w:val="19"/>
         </w:rPr>
-        <w:t xml:space="preserve"> ↓  ↓  ↓  ↓  ↓  ↓  ↓  ↓ </w:t>
+        <w:t xml:space="preserve"> →  →  →  →  →  →  →  → </w:t>
       </w:r>
     </w:p>
     <w:p>
@@ -1488,7 +1416,7 @@
           <w:color w:val="333333"/>
           <w:sz w:val="19"/>
         </w:rPr>
-        <w:t xml:space="preserve"> ↓  ↓  ↓  ↓  ↓  ↓  ↓  ↓ </w:t>
+        <w:t xml:space="preserve"> →  →  →  →  →  →  →  → </w:t>
       </w:r>
     </w:p>
     <w:p>
@@ -1514,7 +1442,7 @@
           <w:color w:val="C0392B"/>
           <w:sz w:val="22"/>
         </w:rPr>
-        <w:t>⚠️ 关键发现：DQN 策略退化</w:t>
+        <w:t>关键发现：DQN 策略退化</w:t>
       </w:r>
     </w:p>
     <w:p>
@@ -1523,7 +1451,7 @@
         <w:ind w:left="850"/>
       </w:pPr>
       <w:r>
-        <w:t>DQN 学到的策略是"一路往下走"——走 8 步到最底行</w:t>
+        <w:t>DQN 学到的策略偏向"一路向右"，能避开陷阱，但缺少 Q-learning 那样稳定的绕行路径</w:t>
       </w:r>
     </w:p>
     <w:p>
@@ -1532,7 +1460,7 @@
         <w:ind w:left="850"/>
       </w:pPr>
       <w:r>
-        <w:t>虽然到不了终点，但也不撞陷阱——成了 DQN 的"局部最优解"</w:t>
+        <w:t>最后 200 局到达率：Q-learning 90.5%，DQN 75.0%，说明 DQN 在 8×8 上效率明显下降</w:t>
       </w:r>
     </w:p>
     <w:p>
@@ -1654,7 +1582,7 @@
           <w:color w:val="666666"/>
           <w:sz w:val="20"/>
         </w:rPr>
-        <w:t xml:space="preserve">  8×8 结论：状态数翻 4 倍后，DQN 开始掉队。参数多了但没学好，策略退化到"只会往下走"。Q-learning 仍然稳定。但 Q 表参数已达 256，再多状态就开始装不下了。</w:t>
+        <w:t xml:space="preserve">  8×8 结论：状态数翻 4 倍后，DQN 开始掉队。参数多了但没学好，策略退化到"偏向单一方向"。Q-learning 仍然稳定。但 Q 表参数已达 256，再多状态就开始装不下了。</w:t>
       </w:r>
     </w:p>
     <w:p>
@@ -1889,7 +1817,7 @@
                 <w:rFonts w:ascii="微软雅黑" w:hAnsi="微软雅黑"/>
                 <w:sz w:val="20"/>
               </w:rPr>
-              <w:t>+0.83</w:t>
+              <w:t>+0.81</w:t>
             </w:r>
           </w:p>
         </w:tc>
@@ -1903,7 +1831,7 @@
                 <w:rFonts w:ascii="微软雅黑" w:hAnsi="微软雅黑"/>
                 <w:sz w:val="20"/>
               </w:rPr>
-              <w:t>+0.82</w:t>
+              <w:t>+0.78</w:t>
             </w:r>
           </w:p>
         </w:tc>
@@ -1917,7 +1845,7 @@
                 <w:rFonts w:ascii="微软雅黑" w:hAnsi="微软雅黑"/>
                 <w:sz w:val="20"/>
               </w:rPr>
-              <w:t>0.3s</w:t>
+              <w:t>0.18s</w:t>
             </w:r>
           </w:p>
         </w:tc>
@@ -1931,7 +1859,7 @@
                 <w:rFonts w:ascii="微软雅黑" w:hAnsi="微软雅黑"/>
                 <w:sz w:val="20"/>
               </w:rPr>
-              <w:t>248s</w:t>
+              <w:t>218.50s</w:t>
             </w:r>
           </w:p>
         </w:tc>
@@ -2003,7 +1931,7 @@
                 <w:rFonts w:ascii="微软雅黑" w:hAnsi="微软雅黑"/>
                 <w:sz w:val="20"/>
               </w:rPr>
-              <w:t>+0.76</w:t>
+              <w:t>+0.81</w:t>
             </w:r>
           </w:p>
         </w:tc>
@@ -2017,7 +1945,7 @@
                 <w:rFonts w:ascii="微软雅黑" w:hAnsi="微软雅黑"/>
                 <w:sz w:val="20"/>
               </w:rPr>
-              <w:t>+0.40</w:t>
+              <w:t>+0.50</w:t>
             </w:r>
           </w:p>
         </w:tc>
@@ -2031,7 +1959,7 @@
                 <w:rFonts w:ascii="微软雅黑" w:hAnsi="微软雅黑"/>
                 <w:sz w:val="20"/>
               </w:rPr>
-              <w:t>0.8s</w:t>
+              <w:t>0.45s</w:t>
             </w:r>
           </w:p>
         </w:tc>
@@ -2045,121 +1973,7 @@
                 <w:rFonts w:ascii="微软雅黑" w:hAnsi="微软雅黑"/>
                 <w:sz w:val="20"/>
               </w:rPr>
-              <w:t>835s</w:t>
-            </w:r>
-          </w:p>
-        </w:tc>
-      </w:tr>
-      <w:tr>
-        <w:tc>
-          <w:tcPr>
-            <w:tcW w:type="dxa" w:w="1080"/>
-          </w:tcPr>
-          <w:p>
-            <w:r>
-              <w:rPr>
-                <w:rFonts w:ascii="微软雅黑" w:hAnsi="微软雅黑"/>
-                <w:sz w:val="20"/>
-              </w:rPr>
-              <w:t>12×12</w:t>
-            </w:r>
-          </w:p>
-        </w:tc>
-        <w:tc>
-          <w:tcPr>
-            <w:tcW w:type="dxa" w:w="1080"/>
-          </w:tcPr>
-          <w:p>
-            <w:r>
-              <w:rPr>
-                <w:rFonts w:ascii="微软雅黑" w:hAnsi="微软雅黑"/>
-                <w:sz w:val="20"/>
-              </w:rPr>
-              <w:t>144</w:t>
-            </w:r>
-          </w:p>
-        </w:tc>
-        <w:tc>
-          <w:tcPr>
-            <w:tcW w:type="dxa" w:w="1080"/>
-          </w:tcPr>
-          <w:p>
-            <w:r>
-              <w:rPr>
-                <w:rFonts w:ascii="微软雅黑" w:hAnsi="微软雅黑"/>
-                <w:sz w:val="20"/>
-              </w:rPr>
-              <w:t>576</w:t>
-            </w:r>
-          </w:p>
-        </w:tc>
-        <w:tc>
-          <w:tcPr>
-            <w:tcW w:type="dxa" w:w="1080"/>
-          </w:tcPr>
-          <w:p>
-            <w:r>
-              <w:rPr>
-                <w:rFonts w:ascii="微软雅黑" w:hAnsi="微软雅黑"/>
-                <w:sz w:val="20"/>
-              </w:rPr>
-              <w:t>~9,476</w:t>
-            </w:r>
-          </w:p>
-        </w:tc>
-        <w:tc>
-          <w:tcPr>
-            <w:tcW w:type="dxa" w:w="1080"/>
-          </w:tcPr>
-          <w:p>
-            <w:r>
-              <w:rPr>
-                <w:rFonts w:ascii="微软雅黑" w:hAnsi="微软雅黑"/>
-                <w:sz w:val="20"/>
-              </w:rPr>
-              <w:t>—</w:t>
-            </w:r>
-          </w:p>
-        </w:tc>
-        <w:tc>
-          <w:tcPr>
-            <w:tcW w:type="dxa" w:w="1080"/>
-          </w:tcPr>
-          <w:p>
-            <w:r>
-              <w:rPr>
-                <w:rFonts w:ascii="微软雅黑" w:hAnsi="微软雅黑"/>
-                <w:sz w:val="20"/>
-              </w:rPr>
-              <w:t>—</w:t>
-            </w:r>
-          </w:p>
-        </w:tc>
-        <w:tc>
-          <w:tcPr>
-            <w:tcW w:type="dxa" w:w="1080"/>
-          </w:tcPr>
-          <w:p>
-            <w:r>
-              <w:rPr>
-                <w:rFonts w:ascii="微软雅黑" w:hAnsi="微软雅黑"/>
-                <w:sz w:val="20"/>
-              </w:rPr>
-              <w:t>—</w:t>
-            </w:r>
-          </w:p>
-        </w:tc>
-        <w:tc>
-          <w:tcPr>
-            <w:tcW w:type="dxa" w:w="1080"/>
-          </w:tcPr>
-          <w:p>
-            <w:r>
-              <w:rPr>
-                <w:rFonts w:ascii="微软雅黑" w:hAnsi="微软雅黑"/>
-                <w:sz w:val="20"/>
-              </w:rPr>
-              <w:t>—</w:t>
+              <w:t>851.14s</w:t>
             </w:r>
           </w:p>
         </w:tc>
@@ -2644,7 +2458,7 @@
           <w:b w:val="0"/>
           <w:sz w:val="24"/>
         </w:rPr>
-        <w:t>4. 面试回答用 8×8 结果作为例子：DQN 策略退化的原因就是参数多、调参难</w:t>
+        <w:t>4. 面试回答用 8×8 结果作为例子：DQN 策略退化的原因就是参数多、样本效率低、调参难</w:t>
       </w:r>
     </w:p>
     <w:p>

</xml_diff>